<commit_message>
af e ad v6 , v3
</commit_message>
<xml_diff>
--- a/documentazione/Analisi Funzionali/LogiChain_Analisi_Database_V3.docx
+++ b/documentazione/Analisi Funzionali/LogiChain_Analisi_Database_V3.docx
@@ -1,5 +1,27 @@
 
-<file path=word/document.xml><?xml version="1.0" encoding="utf-8"?>
+<file path=docProps\app.xml><?xml version="1.0" encoding="utf-8"?>
+<Properties xmlns="http://schemas.openxmlformats.org/officeDocument/2006/extended-properties" xmlns:vt="http://schemas.openxmlformats.org/officeDocument/2006/docPropsVTypes"/>
+</file>
+
+<file path=docProps\core.xml><?xml version="1.0" encoding="utf-8"?>
+<cp:coreProperties xmlns:cp="http://schemas.openxmlformats.org/package/2006/metadata/core-properties" xmlns:dc="http://purl.org/dc/elements/1.1/" xmlns:dcterms="http://purl.org/dc/terms/" xmlns:dcmitype="http://purl.org/dc/dcmitype/" xmlns:xsi="http://www.w3.org/2001/XMLSchema-instance">
+  <dc:creator>Un-named</dc:creator>
+  <cp:lastModifiedBy>Un-named</cp:lastModifiedBy>
+  <cp:revision>1</cp:revision>
+  <dcterms:created xsi:type="dcterms:W3CDTF">2026-06-06T23:02:57.179Z</dcterms:created>
+  <dcterms:modified xsi:type="dcterms:W3CDTF">2026-06-06T23:02:57.191Z</dcterms:modified>
+</cp:coreProperties>
+</file>
+
+<file path=docProps\custom.xml><?xml version="1.0" encoding="utf-8"?>
+<Properties xmlns="http://schemas.openxmlformats.org/officeDocument/2006/custom-properties" xmlns:vt="http://schemas.openxmlformats.org/officeDocument/2006/docPropsVTypes"/>
+</file>
+
+<file path=word\comments.xml><?xml version="1.0" encoding="utf-8"?>
+<w:comments xmlns:cx="http://schemas.microsoft.com/office/drawing/2014/chartex" xmlns:cx1="http://schemas.microsoft.com/office/drawing/2015/9/8/chartex" xmlns:cx2="http://schemas.microsoft.com/office/drawing/2015/10/21/chartex" xmlns:cx3="http://schemas.microsoft.com/office/drawing/2016/5/9/chartex" xmlns:cx4="http://schemas.microsoft.com/office/drawing/2016/5/10/chartex" xmlns:cx5="http://schemas.microsoft.com/office/drawing/2016/5/11/chartex" xmlns:cx6="http://schemas.microsoft.com/office/drawing/2016/5/12/chartex" xmlns:cx7="http://schemas.microsoft.com/office/drawing/2016/5/13/chartex" xmlns:cx8="http://schemas.microsoft.com/office/drawing/2016/5/14/chartex" xmlns:mc="http://schemas.openxmlformats.org/markup-compatibility/2006" xmlns:aink="http://schemas.microsoft.com/office/drawing/2016/ink" xmlns:am3d="http://schemas.microsoft.com/office/drawing/2017/model3d" xmlns:o="urn:schemas-microsoft-com:office:office" xmlns:r="http://schemas.openxmlformats.org/officeDocument/2006/relationships" xmlns:m="http://schemas.openxmlformats.org/officeDocument/2006/math" xmlns:v="urn:schemas-microsoft-com:vml" xmlns:wp14="http://schemas.microsoft.com/office/word/2010/wordprocessingDrawing" xmlns:wp="http://schemas.openxmlformats.org/drawingml/2006/wordprocessingDrawing" xmlns:w10="urn:schemas-microsoft-com:office:word" xmlns:w="http://schemas.openxmlformats.org/wordprocessingml/2006/main" xmlns:w14="http://schemas.microsoft.com/office/word/2010/wordml" xmlns:w15="http://schemas.microsoft.com/office/word/2012/wordml" xmlns:w16cex="http://schemas.microsoft.com/office/word/2018/wordml/cex" xmlns:w16cid="http://schemas.microsoft.com/office/word/2016/wordml/cid" xmlns:w16="http://schemas.microsoft.com/office/word/2018/wordml" xmlns:w16sdtdh="http://schemas.microsoft.com/office/word/2020/wordml/sdtdatahash" xmlns:w16se="http://schemas.microsoft.com/office/word/2015/wordml/symex" xmlns:wpg="http://schemas.microsoft.com/office/word/2010/wordprocessingGroup" xmlns:wpi="http://schemas.microsoft.com/office/word/2010/wordprocessingInk" xmlns:wne="http://schemas.microsoft.com/office/word/2006/wordml" xmlns:wps="http://schemas.microsoft.com/office/word/2010/wordprocessingShape"/>
+</file>
+
+<file path=word\document.xml><?xml version="1.0" encoding="utf-8"?>
 <w:document xmlns:wpc="http://schemas.microsoft.com/office/word/2010/wordprocessingCanvas" xmlns:mc="http://schemas.openxmlformats.org/markup-compatibility/2006" xmlns:o="urn:schemas-microsoft-com:office:office" xmlns:r="http://schemas.openxmlformats.org/officeDocument/2006/relationships" xmlns:m="http://schemas.openxmlformats.org/officeDocument/2006/math" xmlns:v="urn:schemas-microsoft-com:vml" xmlns:wp14="http://schemas.microsoft.com/office/word/2010/wordprocessingDrawing" xmlns:wp="http://schemas.openxmlformats.org/drawingml/2006/wordprocessingDrawing" xmlns:w10="urn:schemas-microsoft-com:office:word" xmlns:w="http://schemas.openxmlformats.org/wordprocessingml/2006/main" xmlns:w14="http://schemas.microsoft.com/office/word/2010/wordml" xmlns:w15="http://schemas.microsoft.com/office/word/2012/wordml" xmlns:wpg="http://schemas.microsoft.com/office/word/2010/wordprocessingGroup" xmlns:wpi="http://schemas.microsoft.com/office/word/2010/wordprocessingInk" xmlns:wne="http://schemas.microsoft.com/office/word/2006/wordml" xmlns:wps="http://schemas.microsoft.com/office/word/2010/wordprocessingShape" xmlns:cx="http://schemas.microsoft.com/office/drawing/2014/chartex" xmlns:cx1="http://schemas.microsoft.com/office/drawing/2015/9/8/chartex" xmlns:cx2="http://schemas.microsoft.com/office/drawing/2015/10/21/chartex" xmlns:cx3="http://schemas.microsoft.com/office/drawing/2016/5/9/chartex" xmlns:cx4="http://schemas.microsoft.com/office/drawing/2016/5/10/chartex" xmlns:cx5="http://schemas.microsoft.com/office/drawing/2016/5/11/chartex" xmlns:cx6="http://schemas.microsoft.com/office/drawing/2016/5/12/chartex" xmlns:cx7="http://schemas.microsoft.com/office/drawing/2016/5/13/chartex" xmlns:cx8="http://schemas.microsoft.com/office/drawing/2016/5/14/chartex" xmlns:aink="http://schemas.microsoft.com/office/drawing/2016/ink" xmlns:am3d="http://schemas.microsoft.com/office/drawing/2017/model3d" xmlns:w16cex="http://schemas.microsoft.com/office/word/2018/wordml/cex" xmlns:w16cid="http://schemas.microsoft.com/office/word/2016/wordml/cid" xmlns:w16="http://schemas.microsoft.com/office/word/2018/wordml" xmlns:w16sdtdh="http://schemas.microsoft.com/office/word/2020/wordml/sdtdatahash" xmlns:w16se="http://schemas.microsoft.com/office/word/2015/wordml/symex" mc:Ignorable="w14 w15 wp14">
   <w:body>
     <w:p>
@@ -18,7 +40,7 @@
           <w:sz w:val="44"/>
           <w:szCs w:val="44"/>
         </w:rPr>
-        <w:t xml:space="preserve">LogiChain ERP — Analisi Schema Database</w:t>
+        <w:t xml:space="preserve">LogiChain ERP â€” Analisi Schema Database</w:t>
       </w:r>
     </w:p>
     <w:p>
@@ -120,7 +142,7 @@
                 <w:sz w:val="18"/>
                 <w:szCs w:val="18"/>
               </w:rPr>
-              <w:t xml:space="preserve">LogiChain ERP — Analisi Schema Database V3.0</w:t>
+              <w:t xml:space="preserve">LogiChain ERP â€” Analisi Schema Database V3.0</w:t>
             </w:r>
           </w:p>
         </w:tc>
@@ -189,7 +211,7 @@
                 <w:sz w:val="18"/>
                 <w:szCs w:val="18"/>
               </w:rPr>
-              <w:t xml:space="preserve">V3.0 — Schema SQL Definitivo (verificato su dump PostgreSQL 18.4 e su migration consolidate 001–011)</w:t>
+              <w:t xml:space="preserve">V3.0 â€” Schema SQL Definitivo (verificato su dump PostgreSQL 18.4 e su migration consolidate 001â€“011)</w:t>
             </w:r>
           </w:p>
         </w:tc>
@@ -258,7 +280,7 @@
                 <w:sz w:val="18"/>
                 <w:szCs w:val="18"/>
               </w:rPr>
-              <w:t xml:space="preserve">migrations/ 001–011 consolidate + dump logichain_schemas_v2.sql</w:t>
+              <w:t xml:space="preserve">migrations/ 001â€“011 consolidate + dump logichain_schemas_v2.sql</w:t>
             </w:r>
           </w:p>
         </w:tc>
@@ -603,7 +625,7 @@
                 <w:sz w:val="18"/>
                 <w:szCs w:val="18"/>
               </w:rPr>
-              <w:t xml:space="preserve">Approvato — baseline migration consolidata 001–011, allineato a dump SQL e codebase</w:t>
+              <w:t xml:space="preserve">Approvato â€” baseline migration consolidata 001â€“011, allineato a dump SQL e codebase</w:t>
             </w:r>
           </w:p>
         </w:tc>
@@ -664,7 +686,7 @@
           <w:sz w:val="18"/>
           <w:szCs w:val="18"/>
         </w:rPr>
-        <w:t xml:space="preserve">Questo documento (V3) è la versione verificata e ri-allineata al codebase corrente. Le sezioni successive documentano lo schema REALE del DB, non quello teorico. La baseline migration è stata consolidata in 11 file dominio-organizzati (001_enums_and_functions → 011_ecosistema) che sostituiscono la sequenza legacy 001→113; lo schema risultante è identico al dump SQL. Fonte autoritativa: migrations consolidate 001–011 + logichain_schemas_v2.sql.</w:t>
+        <w:t xml:space="preserve">Questo documento (V3) Ã¨ la versione verificata e ri-allineata al codebase corrente. Le sezioni successive documentano lo schema REALE del DB, non quello teorico. La baseline migration Ã¨ stata consolidata in 11 file dominio-organizzati (001_enums_and_functions â†’ 011_ecosistema) che sostituiscono la sequenza legacy 001â†’113; lo schema risultante Ã¨ identico al dump SQL. Fonte autoritativa: migrations consolidate 001â€“011 + logichain_schemas_v2.sql.</w:t>
       </w:r>
     </w:p>
     <w:p>
@@ -938,7 +960,7 @@
                 <w:sz w:val="18"/>
                 <w:szCs w:val="18"/>
               </w:rPr>
-              <w:t xml:space="preserve">7 ✓</w:t>
+              <w:t xml:space="preserve">7 âœ“</w:t>
             </w:r>
           </w:p>
         </w:tc>
@@ -972,7 +994,7 @@
                 <w:sz w:val="18"/>
                 <w:szCs w:val="18"/>
               </w:rPr>
-              <w:t xml:space="preserve">✅ OK</w:t>
+              <w:t xml:space="preserve">âœ… OK</w:t>
             </w:r>
           </w:p>
         </w:tc>
@@ -1073,7 +1095,7 @@
                 <w:sz w:val="18"/>
                 <w:szCs w:val="18"/>
               </w:rPr>
-              <w:t xml:space="preserve">27 (+pgmigrations) ✓</w:t>
+              <w:t xml:space="preserve">27 (+pgmigrations) âœ“</w:t>
             </w:r>
           </w:p>
         </w:tc>
@@ -1107,7 +1129,7 @@
                 <w:sz w:val="18"/>
                 <w:szCs w:val="18"/>
               </w:rPr>
-              <w:t xml:space="preserve">✅ OK</w:t>
+              <w:t xml:space="preserve">âœ… OK</w:t>
             </w:r>
           </w:p>
         </w:tc>
@@ -1175,7 +1197,7 @@
                 <w:sz w:val="18"/>
                 <w:szCs w:val="18"/>
               </w:rPr>
-              <w:t xml:space="preserve">11 file consolidati 001–011 (sostituiscono la sequenza legacy 001→113)</w:t>
+              <w:t xml:space="preserve">11 file consolidati 001â€“011 (sostituiscono la sequenza legacy 001â†’113)</w:t>
             </w:r>
           </w:p>
         </w:tc>
@@ -1208,7 +1230,7 @@
                 <w:sz w:val="18"/>
                 <w:szCs w:val="18"/>
               </w:rPr>
-              <w:t xml:space="preserve">52 ✓</w:t>
+              <w:t xml:space="preserve">52 âœ“</w:t>
             </w:r>
           </w:p>
         </w:tc>
@@ -1242,7 +1264,7 @@
                 <w:sz w:val="18"/>
                 <w:szCs w:val="18"/>
               </w:rPr>
-              <w:t xml:space="preserve">✅ OK</w:t>
+              <w:t xml:space="preserve">âœ… OK</w:t>
             </w:r>
           </w:p>
         </w:tc>
@@ -1343,7 +1365,7 @@
                 <w:sz w:val="18"/>
                 <w:szCs w:val="18"/>
               </w:rPr>
-              <w:t xml:space="preserve">DEFAULT 'manual'::text ✓</w:t>
+              <w:t xml:space="preserve">DEFAULT 'manual'::text âœ“</w:t>
             </w:r>
           </w:p>
         </w:tc>
@@ -1377,7 +1399,7 @@
                 <w:sz w:val="18"/>
                 <w:szCs w:val="18"/>
               </w:rPr>
-              <w:t xml:space="preserve">✅ OK</w:t>
+              <w:t xml:space="preserve">âœ… OK</w:t>
             </w:r>
           </w:p>
         </w:tc>
@@ -1478,7 +1500,7 @@
                 <w:sz w:val="18"/>
                 <w:szCs w:val="18"/>
               </w:rPr>
-              <w:t xml:space="preserve">Tutti presenti ✓</w:t>
+              <w:t xml:space="preserve">Tutti presenti âœ“</w:t>
             </w:r>
           </w:p>
         </w:tc>
@@ -1512,7 +1534,7 @@
                 <w:sz w:val="18"/>
                 <w:szCs w:val="18"/>
               </w:rPr>
-              <w:t xml:space="preserve">✅ OK</w:t>
+              <w:t xml:space="preserve">âœ… OK</w:t>
             </w:r>
           </w:p>
         </w:tc>
@@ -1613,7 +1635,7 @@
                 <w:sz w:val="18"/>
                 <w:szCs w:val="18"/>
               </w:rPr>
-              <w:t xml:space="preserve">FOR EACH ROW ✓</w:t>
+              <w:t xml:space="preserve">FOR EACH ROW âœ“</w:t>
             </w:r>
           </w:p>
         </w:tc>
@@ -1647,7 +1669,7 @@
                 <w:sz w:val="18"/>
                 <w:szCs w:val="18"/>
               </w:rPr>
-              <w:t xml:space="preserve">✅ OK</w:t>
+              <w:t xml:space="preserve">âœ… OK</w:t>
             </w:r>
           </w:p>
         </w:tc>
@@ -1782,7 +1804,7 @@
                 <w:sz w:val="18"/>
                 <w:szCs w:val="18"/>
               </w:rPr>
-              <w:t xml:space="preserve">⚠️ DIVERGE</w:t>
+              <w:t xml:space="preserve">âš ï¸ DIVERGE</w:t>
             </w:r>
           </w:p>
         </w:tc>
@@ -1917,7 +1939,7 @@
                 <w:sz w:val="18"/>
                 <w:szCs w:val="18"/>
               </w:rPr>
-              <w:t xml:space="preserve">✅ più forte</w:t>
+              <w:t xml:space="preserve">âœ… piÃ¹ forte</w:t>
             </w:r>
           </w:p>
         </w:tc>
@@ -2052,7 +2074,7 @@
                 <w:sz w:val="18"/>
                 <w:szCs w:val="18"/>
               </w:rPr>
-              <w:t xml:space="preserve">✅ Risolto in baseline 001–011</w:t>
+              <w:t xml:space="preserve">âœ… Risolto in baseline 001â€“011</w:t>
             </w:r>
           </w:p>
         </w:tc>
@@ -2187,7 +2209,7 @@
                 <w:sz w:val="18"/>
                 <w:szCs w:val="18"/>
               </w:rPr>
-              <w:t xml:space="preserve">⚠️ Aggiunto</w:t>
+              <w:t xml:space="preserve">âš ï¸ Aggiunto</w:t>
             </w:r>
           </w:p>
         </w:tc>
@@ -2322,7 +2344,7 @@
                 <w:sz w:val="18"/>
                 <w:szCs w:val="18"/>
               </w:rPr>
-              <w:t xml:space="preserve">⚠️ Aggiornato</w:t>
+              <w:t xml:space="preserve">âš ï¸ Aggiornato</w:t>
             </w:r>
           </w:p>
         </w:tc>
@@ -2457,7 +2479,7 @@
                 <w:sz w:val="18"/>
                 <w:szCs w:val="18"/>
               </w:rPr>
-              <w:t xml:space="preserve">⚠️ Mancante</w:t>
+              <w:t xml:space="preserve">âš ï¸ Mancante</w:t>
             </w:r>
           </w:p>
         </w:tc>
@@ -2518,7 +2540,7 @@
           <w:sz w:val="20"/>
           <w:szCs w:val="20"/>
         </w:rPr>
-        <w:t xml:space="preserve">27 tabelle applicative (+ pgmigrations di node-pg-migrate), 7 enum, 49 indici, 113 migration. Il dump SQL è la fonte autoritativa — in caso di discrepanza prevale sempre il dump/SQL.</w:t>
+        <w:t xml:space="preserve">27 tabelle applicative (+ pgmigrations di node-pg-migrate), 7 enum, 49 indici, 113 migration. Il dump SQL Ã¨ la fonte autoritativa â€” in caso di discrepanza prevale sempre il dump/SQL.</w:t>
       </w:r>
     </w:p>
     <w:p>
@@ -2596,7 +2618,7 @@
           <w:sz w:val="20"/>
           <w:szCs w:val="20"/>
         </w:rPr>
-        <w:t xml:space="preserve">Audit log immutabile: movimenti_stock è append-only rinforzato da 2 RULES PostgreSQL (no_update_rule + no_delete_rule) — più forte del solo service layer.</w:t>
+        <w:t xml:space="preserve">Audit log immutabile: movimenti_stock Ã¨ append-only rinforzato da 2 RULES PostgreSQL (no_update_rule + no_delete_rule) â€” piÃ¹ forte del solo service layer.</w:t>
       </w:r>
     </w:p>
     <w:p>
@@ -2676,7 +2698,7 @@
           <w:sz w:val="20"/>
           <w:szCs w:val="20"/>
         </w:rPr>
-        <w:t xml:space="preserve">CHECK(quantita &gt;= 0) su giacenze — backstop DB contro stock negativo.</w:t>
+        <w:t xml:space="preserve">CHECK(quantita &gt;= 0) su giacenze â€” backstop DB contro stock negativo.</w:t>
       </w:r>
     </w:p>
     <w:p>
@@ -2902,7 +2924,7 @@
                 <w:sz w:val="18"/>
                 <w:szCs w:val="18"/>
               </w:rPr>
-              <w:t xml:space="preserve">BOZZA · INVIATO · CONFERMATO · IN_RICEZIONE · COMPLETATO · ANNULLATO</w:t>
+              <w:t xml:space="preserve">BOZZA Â· INVIATO Â· CONFERMATO Â· IN_RICEZIONE Â· COMPLETATO Â· ANNULLATO</w:t>
             </w:r>
           </w:p>
         </w:tc>
@@ -3003,7 +3025,7 @@
                 <w:sz w:val="18"/>
                 <w:szCs w:val="18"/>
               </w:rPr>
-              <w:t xml:space="preserve">BOZZA · CONFERMATO · SPEDITO · ANNULLATO</w:t>
+              <w:t xml:space="preserve">BOZZA Â· CONFERMATO Â· SPEDITO Â· ANNULLATO</w:t>
             </w:r>
           </w:p>
         </w:tc>
@@ -3104,7 +3126,7 @@
                 <w:sz w:val="18"/>
                 <w:szCs w:val="18"/>
               </w:rPr>
-              <w:t xml:space="preserve">NON_AVVIATO · IN_PICKING · PICKING_COMPLETATO</w:t>
+              <w:t xml:space="preserve">NON_AVVIATO Â· IN_PICKING Â· PICKING_COMPLETATO</w:t>
             </w:r>
           </w:p>
         </w:tc>
@@ -3205,7 +3227,7 @@
                 <w:sz w:val="18"/>
                 <w:szCs w:val="18"/>
               </w:rPr>
-              <w:t xml:space="preserve">IN_PREPARAZIONE · SPEDITA · CONSEGNATA · PROBLEMA</w:t>
+              <w:t xml:space="preserve">IN_PREPARAZIONE Â· SPEDITA Â· CONSEGNATA Â· PROBLEMA</w:t>
             </w:r>
           </w:p>
         </w:tc>
@@ -3306,7 +3328,7 @@
                 <w:sz w:val="18"/>
                 <w:szCs w:val="18"/>
               </w:rPr>
-              <w:t xml:space="preserve">CARICO_ACQUISTO · SCARICO_VENDITA · SPOSTAMENTO · RETTIFICA_POSITIVA · RETTIFICA_NEGATIVA · RESO</w:t>
+              <w:t xml:space="preserve">CARICO_ACQUISTO Â· SCARICO_VENDITA Â· SPOSTAMENTO Â· RETTIFICA_POSITIVA Â· RETTIFICA_NEGATIVA Â· RESO</w:t>
             </w:r>
           </w:p>
         </w:tc>
@@ -3408,7 +3430,7 @@
                 <w:sz w:val="18"/>
                 <w:szCs w:val="18"/>
               </w:rPr>
-              <w:t xml:space="preserve">SOTTO_SCORTA · PO_IN_RITARDO · RICEZIONE_PARZIALE · CAMBIO_STATO_SPEDIZIONE · ALTRO · RICHIESTA_ACCETTATA · RICHIESTA_RIFIUTATA · MESSAGGIO_FORNITORE</w:t>
+              <w:t xml:space="preserve">SOTTO_SCORTA Â· PO_IN_RITARDO Â· RICEZIONE_PARZIALE Â· CAMBIO_STATO_SPEDIZIONE Â· ALTRO Â· RICHIESTA_ACCETTATA Â· RICHIESTA_RIFIUTATA Â· MESSAGGIO_FORNITORE</w:t>
             </w:r>
           </w:p>
         </w:tc>
@@ -3512,7 +3534,7 @@
                 <w:sz w:val="18"/>
                 <w:szCs w:val="18"/>
               </w:rPr>
-              <w:t xml:space="preserve">BOZZA · INVIATA · IN_VALUTAZIONE · ACCETTATA · RIFIUTATA</w:t>
+              <w:t xml:space="preserve">BOZZA Â· INVIATA Â· IN_VALUTAZIONE Â· ACCETTATA Â· RIFIUTATA</w:t>
             </w:r>
           </w:p>
         </w:tc>
@@ -3546,7 +3568,7 @@
                 <w:sz w:val="18"/>
                 <w:szCs w:val="18"/>
               </w:rPr>
-              <w:t xml:space="preserve">NUOVO V2 — migration 104</w:t>
+              <w:t xml:space="preserve">NUOVO V2 â€” migration 104</w:t>
             </w:r>
           </w:p>
         </w:tc>
@@ -3588,7 +3610,7 @@
           <w:sz w:val="20"/>
           <w:szCs w:val="20"/>
         </w:rPr>
-        <w:t xml:space="preserve">4. Tabelle — Variazioni Significative da V1.3</w:t>
+        <w:t xml:space="preserve">4. Tabelle â€” Variazioni Significative da V1.3</w:t>
       </w:r>
     </w:p>
     <w:p>
@@ -3607,7 +3629,7 @@
           <w:sz w:val="18"/>
           <w:szCs w:val="18"/>
         </w:rPr>
-        <w:t xml:space="preserve">Per le tabelle invariate rispetto a V1.3 (ruoli, permessi, ruoli_permessi, utenti, notifiche, categorie, contatti_fornitori, ordini_acquisto, righe_po, ricezioni, righe_ricezione, ordini, righe_ordine, giacenze) lo schema è conforme a V1.3 salvo i rinominamenti documentati in sez. 11.</w:t>
+        <w:t xml:space="preserve">Per le tabelle invariate rispetto a V1.3 (ruoli, permessi, ruoli_permessi, utenti, notifiche, categorie, contatti_fornitori, ordini_acquisto, righe_po, ricezioni, righe_ricezione, ordini, righe_ordine, giacenze) lo schema Ã¨ conforme a V1.3 salvo i rinominamenti documentati in sez. 11.</w:t>
       </w:r>
     </w:p>
     <w:p>
@@ -4054,7 +4076,7 @@
                 <w:sz w:val="18"/>
                 <w:szCs w:val="18"/>
               </w:rPr>
-              <w:t xml:space="preserve">NOT NULL FK → prodotti RESTRICT</w:t>
+              <w:t xml:space="preserve">NOT NULL FK â†’ prodotti RESTRICT</w:t>
             </w:r>
           </w:p>
         </w:tc>
@@ -4191,7 +4213,7 @@
                 <w:sz w:val="18"/>
                 <w:szCs w:val="18"/>
               </w:rPr>
-              <w:t xml:space="preserve">NOT NULL FK → ubicazioni RESTRICT</w:t>
+              <w:t xml:space="preserve">NOT NULL FK â†’ ubicazioni RESTRICT</w:t>
             </w:r>
           </w:p>
         </w:tc>
@@ -4225,7 +4247,7 @@
                 <w:sz w:val="18"/>
                 <w:szCs w:val="18"/>
               </w:rPr>
-              <w:t xml:space="preserve">SINGOLA — non da/a separati. V1.3 era diverso.</w:t>
+              <w:t xml:space="preserve">SINGOLA â€” non da/a separati. V1.3 era diverso.</w:t>
             </w:r>
           </w:p>
         </w:tc>
@@ -4597,7 +4619,7 @@
                 <w:sz w:val="18"/>
                 <w:szCs w:val="18"/>
               </w:rPr>
-              <w:t xml:space="preserve">—</w:t>
+              <w:t xml:space="preserve">â€”</w:t>
             </w:r>
           </w:p>
         </w:tc>
@@ -4732,7 +4754,7 @@
                 <w:sz w:val="18"/>
                 <w:szCs w:val="18"/>
               </w:rPr>
-              <w:t xml:space="preserve">—</w:t>
+              <w:t xml:space="preserve">â€”</w:t>
             </w:r>
           </w:p>
         </w:tc>
@@ -5069,7 +5091,7 @@
                 <w:sz w:val="18"/>
                 <w:szCs w:val="18"/>
               </w:rPr>
-              <w:t xml:space="preserve">—</w:t>
+              <w:t xml:space="preserve">â€”</w:t>
             </w:r>
           </w:p>
         </w:tc>
@@ -5103,7 +5125,7 @@
                 <w:sz w:val="18"/>
                 <w:szCs w:val="18"/>
               </w:rPr>
-              <w:t xml:space="preserve">—</w:t>
+              <w:t xml:space="preserve">â€”</w:t>
             </w:r>
           </w:p>
         </w:tc>
@@ -5207,7 +5229,7 @@
                 <w:sz w:val="18"/>
                 <w:szCs w:val="18"/>
               </w:rPr>
-              <w:t xml:space="preserve">—</w:t>
+              <w:t xml:space="preserve">â€”</w:t>
             </w:r>
           </w:p>
         </w:tc>
@@ -5309,7 +5331,7 @@
                 <w:sz w:val="18"/>
                 <w:szCs w:val="18"/>
               </w:rPr>
-              <w:t xml:space="preserve">Enforcement append-only a livello DB — più forte del service layer.</w:t>
+              <w:t xml:space="preserve">Enforcement append-only a livello DB â€” piÃ¹ forte del service layer.</w:t>
             </w:r>
           </w:p>
         </w:tc>
@@ -5345,7 +5367,7 @@
                 <w:sz w:val="18"/>
                 <w:szCs w:val="18"/>
               </w:rPr>
-              <w:t xml:space="preserve">—</w:t>
+              <w:t xml:space="preserve">â€”</w:t>
             </w:r>
           </w:p>
         </w:tc>
@@ -6146,7 +6168,7 @@
                 <w:sz w:val="18"/>
                 <w:szCs w:val="18"/>
               </w:rPr>
-              <w:t xml:space="preserve">—</w:t>
+              <w:t xml:space="preserve">â€”</w:t>
             </w:r>
           </w:p>
         </w:tc>
@@ -6280,7 +6302,7 @@
                 <w:sz w:val="18"/>
                 <w:szCs w:val="18"/>
               </w:rPr>
-              <w:t xml:space="preserve">NULLABLE FK → categorie NO ACTION</w:t>
+              <w:t xml:space="preserve">NULLABLE FK â†’ categorie NO ACTION</w:t>
             </w:r>
           </w:p>
         </w:tc>
@@ -6414,7 +6436,7 @@
                 <w:sz w:val="18"/>
                 <w:szCs w:val="18"/>
               </w:rPr>
-              <w:t xml:space="preserve">—</w:t>
+              <w:t xml:space="preserve">â€”</w:t>
             </w:r>
           </w:p>
         </w:tc>
@@ -6548,7 +6570,7 @@
                 <w:sz w:val="18"/>
                 <w:szCs w:val="18"/>
               </w:rPr>
-              <w:t xml:space="preserve">—</w:t>
+              <w:t xml:space="preserve">â€”</w:t>
             </w:r>
           </w:p>
         </w:tc>
@@ -6853,7 +6875,7 @@
                 <w:sz w:val="18"/>
                 <w:szCs w:val="18"/>
               </w:rPr>
-              <w:t xml:space="preserve">V2 NUOVO — listino aziendale</w:t>
+              <w:t xml:space="preserve">V2 NUOVO â€” listino aziendale</w:t>
             </w:r>
           </w:p>
         </w:tc>
@@ -6991,7 +7013,7 @@
                 <w:sz w:val="18"/>
                 <w:szCs w:val="18"/>
               </w:rPr>
-              <w:t xml:space="preserve">V2 NUOVO — aggiornato da trigger trg_data_agg_prezzo</w:t>
+              <w:t xml:space="preserve">V2 NUOVO â€” aggiornato da trigger trg_data_agg_prezzo</w:t>
             </w:r>
           </w:p>
         </w:tc>
@@ -7991,7 +8013,7 @@
                 <w:sz w:val="18"/>
                 <w:szCs w:val="18"/>
               </w:rPr>
-              <w:t xml:space="preserve">Nullable — fornitori esteri senza P.IVA italiana</w:t>
+              <w:t xml:space="preserve">Nullable â€” fornitori esteri senza P.IVA italiana</w:t>
             </w:r>
           </w:p>
         </w:tc>
@@ -8092,7 +8114,7 @@
                 <w:sz w:val="18"/>
                 <w:szCs w:val="18"/>
               </w:rPr>
-              <w:t xml:space="preserve">—</w:t>
+              <w:t xml:space="preserve">â€”</w:t>
             </w:r>
           </w:p>
         </w:tc>
@@ -8226,7 +8248,7 @@
                 <w:sz w:val="18"/>
                 <w:szCs w:val="18"/>
               </w:rPr>
-              <w:t xml:space="preserve">—</w:t>
+              <w:t xml:space="preserve">â€”</w:t>
             </w:r>
           </w:p>
         </w:tc>
@@ -8360,7 +8382,7 @@
                 <w:sz w:val="18"/>
                 <w:szCs w:val="18"/>
               </w:rPr>
-              <w:t xml:space="preserve">—</w:t>
+              <w:t xml:space="preserve">â€”</w:t>
             </w:r>
           </w:p>
         </w:tc>
@@ -8494,7 +8516,7 @@
                 <w:sz w:val="18"/>
                 <w:szCs w:val="18"/>
               </w:rPr>
-              <w:t xml:space="preserve">—</w:t>
+              <w:t xml:space="preserve">â€”</w:t>
             </w:r>
           </w:p>
         </w:tc>
@@ -8665,7 +8687,7 @@
                 <w:sz w:val="18"/>
                 <w:szCs w:val="18"/>
               </w:rPr>
-              <w:t xml:space="preserve">V2 NUOVO — forzato a manual dal service al create</w:t>
+              <w:t xml:space="preserve">V2 NUOVO â€” forzato a manual dal service al create</w:t>
             </w:r>
           </w:p>
         </w:tc>
@@ -8769,7 +8791,7 @@
                 <w:sz w:val="18"/>
                 <w:szCs w:val="18"/>
               </w:rPr>
-              <w:t xml:space="preserve">—</w:t>
+              <w:t xml:space="preserve">â€”</w:t>
             </w:r>
           </w:p>
         </w:tc>
@@ -8907,7 +8929,7 @@
                 <w:sz w:val="18"/>
                 <w:szCs w:val="18"/>
               </w:rPr>
-              <w:t xml:space="preserve">—</w:t>
+              <w:t xml:space="preserve">â€”</w:t>
             </w:r>
           </w:p>
         </w:tc>
@@ -9941,7 +9963,7 @@
                 <w:sz w:val="18"/>
                 <w:szCs w:val="18"/>
               </w:rPr>
-              <w:t xml:space="preserve">Nullable — clienti esteri</w:t>
+              <w:t xml:space="preserve">Nullable â€” clienti esteri</w:t>
             </w:r>
           </w:p>
         </w:tc>
@@ -10042,7 +10064,7 @@
                 <w:sz w:val="18"/>
                 <w:szCs w:val="18"/>
               </w:rPr>
-              <w:t xml:space="preserve">—</w:t>
+              <w:t xml:space="preserve">â€”</w:t>
             </w:r>
           </w:p>
         </w:tc>
@@ -10176,7 +10198,7 @@
                 <w:sz w:val="18"/>
                 <w:szCs w:val="18"/>
               </w:rPr>
-              <w:t xml:space="preserve">—</w:t>
+              <w:t xml:space="preserve">â€”</w:t>
             </w:r>
           </w:p>
         </w:tc>
@@ -11467,7 +11489,7 @@
                 <w:sz w:val="18"/>
                 <w:szCs w:val="18"/>
               </w:rPr>
-              <w:t xml:space="preserve">—</w:t>
+              <w:t xml:space="preserve">â€”</w:t>
             </w:r>
           </w:p>
         </w:tc>
@@ -11601,7 +11623,7 @@
                 <w:sz w:val="18"/>
                 <w:szCs w:val="18"/>
               </w:rPr>
-              <w:t xml:space="preserve">—</w:t>
+              <w:t xml:space="preserve">â€”</w:t>
             </w:r>
           </w:p>
         </w:tc>
@@ -11772,7 +11794,7 @@
                 <w:sz w:val="18"/>
                 <w:szCs w:val="18"/>
               </w:rPr>
-              <w:t xml:space="preserve">Soft delete — non presente in V1.3</w:t>
+              <w:t xml:space="preserve">Soft delete â€” non presente in V1.3</w:t>
             </w:r>
           </w:p>
         </w:tc>
@@ -12101,7 +12123,7 @@
           <w:sz w:val="18"/>
           <w:szCs w:val="18"/>
         </w:rPr>
-        <w:t xml:space="preserve">corriere_id → dipendenti (autista), non → corrieri (azienda). Aggiunto cliente_id e destinazione_id. Rimosso data_spedizione. Rimosso UNIQUE(ordine_id).</w:t>
+        <w:t xml:space="preserve">corriere_id â†’ dipendenti (autista), non â†’ corrieri (azienda). Aggiunto cliente_id e destinazione_id. Rimosso data_spedizione. Rimosso UNIQUE(ordine_id).</w:t>
       </w:r>
     </w:p>
     <w:tbl>
@@ -12490,7 +12512,7 @@
                 <w:sz w:val="18"/>
                 <w:szCs w:val="18"/>
               </w:rPr>
-              <w:t xml:space="preserve">NOT NULL FK → ordini RESTRICT</w:t>
+              <w:t xml:space="preserve">NOT NULL FK â†’ ordini RESTRICT</w:t>
             </w:r>
           </w:p>
         </w:tc>
@@ -12627,7 +12649,7 @@
                 <w:sz w:val="18"/>
                 <w:szCs w:val="18"/>
               </w:rPr>
-              <w:t xml:space="preserve">NOT NULL FK → clienti RESTRICT</w:t>
+              <w:t xml:space="preserve">NOT NULL FK â†’ clienti RESTRICT</w:t>
             </w:r>
           </w:p>
         </w:tc>
@@ -12765,7 +12787,7 @@
                 <w:sz w:val="18"/>
                 <w:szCs w:val="18"/>
               </w:rPr>
-              <w:t xml:space="preserve">NOT NULL FK → destinazioni_clienti RESTRICT</w:t>
+              <w:t xml:space="preserve">NOT NULL FK â†’ destinazioni_clienti RESTRICT</w:t>
             </w:r>
           </w:p>
         </w:tc>
@@ -12799,7 +12821,7 @@
                 <w:sz w:val="18"/>
                 <w:szCs w:val="18"/>
               </w:rPr>
-              <w:t xml:space="preserve">V2 — indirizzo consegna fisso nella spedizione</w:t>
+              <w:t xml:space="preserve">V2 â€” indirizzo consegna fisso nella spedizione</w:t>
             </w:r>
           </w:p>
         </w:tc>
@@ -12903,7 +12925,7 @@
                 <w:sz w:val="18"/>
                 <w:szCs w:val="18"/>
               </w:rPr>
-              <w:t xml:space="preserve">NULLABLE FK → dipendenti ON DELETE SET NULL</w:t>
+              <w:t xml:space="preserve">NULLABLE FK â†’ dipendenti ON DELETE SET NULL</w:t>
             </w:r>
           </w:p>
         </w:tc>
@@ -12937,7 +12959,7 @@
                 <w:sz w:val="18"/>
                 <w:szCs w:val="18"/>
               </w:rPr>
-              <w:t xml:space="preserve">→ DIPENDENTI (autista), non → corrieri (azienda). NULLABLE.</w:t>
+              <w:t xml:space="preserve">â†’ DIPENDENTI (autista), non â†’ corrieri (azienda). NULLABLE.</w:t>
             </w:r>
           </w:p>
         </w:tc>
@@ -13038,7 +13060,7 @@
                 <w:sz w:val="18"/>
                 <w:szCs w:val="18"/>
               </w:rPr>
-              <w:t xml:space="preserve">—</w:t>
+              <w:t xml:space="preserve">â€”</w:t>
             </w:r>
           </w:p>
         </w:tc>
@@ -13205,7 +13227,7 @@
                 <w:sz w:val="18"/>
                 <w:szCs w:val="18"/>
               </w:rPr>
-              <w:t xml:space="preserve">State machine — sez. 6.3</w:t>
+              <w:t xml:space="preserve">State machine â€” sez. 6.3</w:t>
             </w:r>
           </w:p>
         </w:tc>
@@ -13926,7 +13948,7 @@
                 <w:sz w:val="18"/>
                 <w:szCs w:val="18"/>
               </w:rPr>
-              <w:t xml:space="preserve">NOT NULL FK → spedizioni ON DELETE CASCADE  UNIQUE</w:t>
+              <w:t xml:space="preserve">NOT NULL FK â†’ spedizioni ON DELETE CASCADE  UNIQUE</w:t>
             </w:r>
           </w:p>
         </w:tc>
@@ -14340,7 +14362,7 @@
                 <w:sz w:val="18"/>
                 <w:szCs w:val="18"/>
               </w:rPr>
-              <w:t xml:space="preserve">—</w:t>
+              <w:t xml:space="preserve">â€”</w:t>
             </w:r>
           </w:p>
         </w:tc>
@@ -14374,7 +14396,7 @@
                 <w:sz w:val="18"/>
                 <w:szCs w:val="18"/>
               </w:rPr>
-              <w:t xml:space="preserve">Nome trasportatore fisico — non in V1.3</w:t>
+              <w:t xml:space="preserve">Nome trasportatore fisico â€” non in V1.3</w:t>
             </w:r>
           </w:p>
         </w:tc>
@@ -14478,7 +14500,7 @@
                 <w:sz w:val="18"/>
                 <w:szCs w:val="18"/>
               </w:rPr>
-              <w:t xml:space="preserve">—</w:t>
+              <w:t xml:space="preserve">â€”</w:t>
             </w:r>
           </w:p>
         </w:tc>
@@ -14512,7 +14534,7 @@
                 <w:sz w:val="18"/>
                 <w:szCs w:val="18"/>
               </w:rPr>
-              <w:t xml:space="preserve">Note DDT — non in V1.3</w:t>
+              <w:t xml:space="preserve">Note DDT â€” non in V1.3</w:t>
             </w:r>
           </w:p>
         </w:tc>
@@ -15211,7 +15233,7 @@
                 <w:sz w:val="18"/>
                 <w:szCs w:val="18"/>
               </w:rPr>
-              <w:t xml:space="preserve">NOT NULL FK → fornitori NO ACTION</w:t>
+              <w:t xml:space="preserve">NOT NULL FK â†’ fornitori NO ACTION</w:t>
             </w:r>
           </w:p>
         </w:tc>
@@ -15378,7 +15400,7 @@
                 <w:sz w:val="18"/>
                 <w:szCs w:val="18"/>
               </w:rPr>
-              <w:t xml:space="preserve">State machine M16 — sez. 6.4</w:t>
+              <w:t xml:space="preserve">State machine M16 â€” sez. 6.4</w:t>
             </w:r>
           </w:p>
         </w:tc>
@@ -15613,7 +15635,7 @@
                 <w:sz w:val="18"/>
                 <w:szCs w:val="18"/>
               </w:rPr>
-              <w:t xml:space="preserve">—</w:t>
+              <w:t xml:space="preserve">â€”</w:t>
             </w:r>
           </w:p>
         </w:tc>
@@ -15747,7 +15769,7 @@
                 <w:sz w:val="18"/>
                 <w:szCs w:val="18"/>
               </w:rPr>
-              <w:t xml:space="preserve">NULLABLE FK → utenti NO ACTION</w:t>
+              <w:t xml:space="preserve">NULLABLE FK â†’ utenti NO ACTION</w:t>
             </w:r>
           </w:p>
         </w:tc>
@@ -16498,7 +16520,7 @@
                 <w:sz w:val="18"/>
                 <w:szCs w:val="18"/>
               </w:rPr>
-              <w:t xml:space="preserve">NOT NULL FK → richieste_acquisto ON DELETE CASCADE</w:t>
+              <w:t xml:space="preserve">NOT NULL FK â†’ richieste_acquisto ON DELETE CASCADE</w:t>
             </w:r>
           </w:p>
         </w:tc>
@@ -16632,7 +16654,7 @@
                 <w:sz w:val="18"/>
                 <w:szCs w:val="18"/>
               </w:rPr>
-              <w:t xml:space="preserve">NOT NULL FK → prodotti NO ACTION</w:t>
+              <w:t xml:space="preserve">NOT NULL FK â†’ prodotti NO ACTION</w:t>
             </w:r>
           </w:p>
         </w:tc>
@@ -16803,7 +16825,7 @@
                 <w:sz w:val="18"/>
                 <w:szCs w:val="18"/>
               </w:rPr>
-              <w:t xml:space="preserve">Check quantità positiva — non in specifica V2 originale</w:t>
+              <w:t xml:space="preserve">Check quantitÃ  positiva â€” non in specifica V2 originale</w:t>
             </w:r>
           </w:p>
         </w:tc>
@@ -16979,7 +17001,7 @@
           <w:sz w:val="20"/>
           <w:szCs w:val="20"/>
         </w:rPr>
-        <w:t xml:space="preserve">5. Vincoli di Integrità (da dump SQL)</w:t>
+        <w:t xml:space="preserve">5. Vincoli di IntegritÃ  (da dump SQL)</w:t>
       </w:r>
     </w:p>
     <w:p>
@@ -17286,7 +17308,7 @@
                 <w:sz w:val="18"/>
                 <w:szCs w:val="18"/>
               </w:rPr>
-              <w:t xml:space="preserve">Backstop critico — impedisce stock negativo</w:t>
+              <w:t xml:space="preserve">Backstop critico â€” impedisce stock negativo</w:t>
             </w:r>
           </w:p>
         </w:tc>
@@ -17700,7 +17722,7 @@
                 <w:sz w:val="18"/>
                 <w:szCs w:val="18"/>
               </w:rPr>
-              <w:t xml:space="preserve">V2 NUOVO — non in specifica originale, presente nel dump</w:t>
+              <w:t xml:space="preserve">V2 NUOVO â€” non in specifica originale, presente nel dump</w:t>
             </w:r>
           </w:p>
         </w:tc>
@@ -17838,7 +17860,7 @@
                 <w:sz w:val="18"/>
                 <w:szCs w:val="18"/>
               </w:rPr>
-              <w:t xml:space="preserve">DUMMY — enforcement reale tramite RULES, non questo check</w:t>
+              <w:t xml:space="preserve">DUMMY â€” enforcement reale tramite RULES, non questo check</w:t>
             </w:r>
           </w:p>
         </w:tc>
@@ -18642,7 +18664,7 @@
                 <w:sz w:val="18"/>
                 <w:szCs w:val="18"/>
               </w:rPr>
-              <w:t xml:space="preserve">Nullable — non bloccante per fornitori esteri</w:t>
+              <w:t xml:space="preserve">Nullable â€” non bloccante per fornitori esteri</w:t>
             </w:r>
           </w:p>
         </w:tc>
@@ -18776,7 +18798,7 @@
                 <w:sz w:val="18"/>
                 <w:szCs w:val="18"/>
               </w:rPr>
-              <w:t xml:space="preserve">Nullable — non bloccante per clienti esteri</w:t>
+              <w:t xml:space="preserve">Nullable â€” non bloccante per clienti esteri</w:t>
             </w:r>
           </w:p>
         </w:tc>
@@ -19844,7 +19866,7 @@
                 <w:sz w:val="18"/>
                 <w:szCs w:val="18"/>
               </w:rPr>
-              <w:t xml:space="preserve">→ ruoli.id</w:t>
+              <w:t xml:space="preserve">â†’ ruoli.id</w:t>
             </w:r>
           </w:p>
         </w:tc>
@@ -19910,7 +19932,7 @@
                 <w:sz w:val="18"/>
                 <w:szCs w:val="18"/>
               </w:rPr>
-              <w:t xml:space="preserve">Elimina ruolo → rimuove associazioni permesso</w:t>
+              <w:t xml:space="preserve">Elimina ruolo â†’ rimuove associazioni permesso</w:t>
             </w:r>
           </w:p>
         </w:tc>
@@ -19978,7 +20000,7 @@
                 <w:sz w:val="18"/>
                 <w:szCs w:val="18"/>
               </w:rPr>
-              <w:t xml:space="preserve">→ permessi.id</w:t>
+              <w:t xml:space="preserve">â†’ permessi.id</w:t>
             </w:r>
           </w:p>
         </w:tc>
@@ -20044,7 +20066,7 @@
                 <w:sz w:val="18"/>
                 <w:szCs w:val="18"/>
               </w:rPr>
-              <w:t xml:space="preserve">Elimina permesso → rimuove associazioni ruolo</w:t>
+              <w:t xml:space="preserve">Elimina permesso â†’ rimuove associazioni ruolo</w:t>
             </w:r>
           </w:p>
         </w:tc>
@@ -20112,7 +20134,7 @@
                 <w:sz w:val="18"/>
                 <w:szCs w:val="18"/>
               </w:rPr>
-              <w:t xml:space="preserve">→ fornitori.id</w:t>
+              <w:t xml:space="preserve">â†’ fornitori.id</w:t>
             </w:r>
           </w:p>
         </w:tc>
@@ -20246,7 +20268,7 @@
                 <w:sz w:val="18"/>
                 <w:szCs w:val="18"/>
               </w:rPr>
-              <w:t xml:space="preserve">→ clienti.id</w:t>
+              <w:t xml:space="preserve">â†’ clienti.id</w:t>
             </w:r>
           </w:p>
         </w:tc>
@@ -20380,7 +20402,7 @@
                 <w:sz w:val="18"/>
                 <w:szCs w:val="18"/>
               </w:rPr>
-              <w:t xml:space="preserve">→ magazzini.id</w:t>
+              <w:t xml:space="preserve">â†’ magazzini.id</w:t>
             </w:r>
           </w:p>
         </w:tc>
@@ -20514,7 +20536,7 @@
                 <w:sz w:val="18"/>
                 <w:szCs w:val="18"/>
               </w:rPr>
-              <w:t xml:space="preserve">→ ordini_acquisto.id</w:t>
+              <w:t xml:space="preserve">â†’ ordini_acquisto.id</w:t>
             </w:r>
           </w:p>
         </w:tc>
@@ -20648,7 +20670,7 @@
                 <w:sz w:val="18"/>
                 <w:szCs w:val="18"/>
               </w:rPr>
-              <w:t xml:space="preserve">→ ricezioni.id</w:t>
+              <w:t xml:space="preserve">â†’ ricezioni.id</w:t>
             </w:r>
           </w:p>
         </w:tc>
@@ -20782,7 +20804,7 @@
                 <w:sz w:val="18"/>
                 <w:szCs w:val="18"/>
               </w:rPr>
-              <w:t xml:space="preserve">→ ordini.id</w:t>
+              <w:t xml:space="preserve">â†’ ordini.id</w:t>
             </w:r>
           </w:p>
         </w:tc>
@@ -20918,7 +20940,7 @@
                 <w:sz w:val="18"/>
                 <w:szCs w:val="18"/>
               </w:rPr>
-              <w:t xml:space="preserve">→ richieste_acquisto.id</w:t>
+              <w:t xml:space="preserve">â†’ richieste_acquisto.id</w:t>
             </w:r>
           </w:p>
         </w:tc>
@@ -20986,7 +21008,7 @@
                 <w:sz w:val="18"/>
                 <w:szCs w:val="18"/>
               </w:rPr>
-              <w:t xml:space="preserve">V2 NUOVO — eliminare richiesta rimuove le righe</w:t>
+              <w:t xml:space="preserve">V2 NUOVO â€” eliminare richiesta rimuove le righe</w:t>
             </w:r>
           </w:p>
         </w:tc>
@@ -21054,7 +21076,7 @@
                 <w:sz w:val="18"/>
                 <w:szCs w:val="18"/>
               </w:rPr>
-              <w:t xml:space="preserve">→ spedizioni.id</w:t>
+              <w:t xml:space="preserve">â†’ spedizioni.id</w:t>
             </w:r>
           </w:p>
         </w:tc>
@@ -21188,7 +21210,7 @@
                 <w:sz w:val="18"/>
                 <w:szCs w:val="18"/>
               </w:rPr>
-              <w:t xml:space="preserve">→ dipendenti.id</w:t>
+              <w:t xml:space="preserve">â†’ dipendenti.id</w:t>
             </w:r>
           </w:p>
         </w:tc>
@@ -21254,7 +21276,7 @@
                 <w:sz w:val="18"/>
                 <w:szCs w:val="18"/>
               </w:rPr>
-              <w:t xml:space="preserve">Autista NULLABLE. V1.3 prevedeva → corrieri NOT NULL.</w:t>
+              <w:t xml:space="preserve">Autista NULLABLE. V1.3 prevedeva â†’ corrieri NOT NULL.</w:t>
             </w:r>
           </w:p>
         </w:tc>
@@ -21322,7 +21344,7 @@
                 <w:sz w:val="18"/>
                 <w:szCs w:val="18"/>
               </w:rPr>
-              <w:t xml:space="preserve">→ prodotti.id</w:t>
+              <w:t xml:space="preserve">â†’ prodotti.id</w:t>
             </w:r>
           </w:p>
         </w:tc>
@@ -21456,7 +21478,7 @@
                 <w:sz w:val="18"/>
                 <w:szCs w:val="18"/>
               </w:rPr>
-              <w:t xml:space="preserve">→ ubicazioni.id</w:t>
+              <w:t xml:space="preserve">â†’ ubicazioni.id</w:t>
             </w:r>
           </w:p>
         </w:tc>
@@ -21590,7 +21612,7 @@
                 <w:sz w:val="18"/>
                 <w:szCs w:val="18"/>
               </w:rPr>
-              <w:t xml:space="preserve">→ prodotti.id</w:t>
+              <w:t xml:space="preserve">â†’ prodotti.id</w:t>
             </w:r>
           </w:p>
         </w:tc>
@@ -21656,7 +21678,7 @@
                 <w:sz w:val="18"/>
                 <w:szCs w:val="18"/>
               </w:rPr>
-              <w:t xml:space="preserve">Registro immutabile — prodotto non può essere eliminato</w:t>
+              <w:t xml:space="preserve">Registro immutabile â€” prodotto non puÃ² essere eliminato</w:t>
             </w:r>
           </w:p>
         </w:tc>
@@ -21724,7 +21746,7 @@
                 <w:sz w:val="18"/>
                 <w:szCs w:val="18"/>
               </w:rPr>
-              <w:t xml:space="preserve">→ ubicazioni.id</w:t>
+              <w:t xml:space="preserve">â†’ ubicazioni.id</w:t>
             </w:r>
           </w:p>
         </w:tc>
@@ -21790,7 +21812,7 @@
                 <w:sz w:val="18"/>
                 <w:szCs w:val="18"/>
               </w:rPr>
-              <w:t xml:space="preserve">Registro immutabile — ubicazione non può essere eliminata</w:t>
+              <w:t xml:space="preserve">Registro immutabile â€” ubicazione non puÃ² essere eliminata</w:t>
             </w:r>
           </w:p>
         </w:tc>
@@ -21858,7 +21880,7 @@
                 <w:sz w:val="18"/>
                 <w:szCs w:val="18"/>
               </w:rPr>
-              <w:t xml:space="preserve">→ clienti.id</w:t>
+              <w:t xml:space="preserve">â†’ clienti.id</w:t>
             </w:r>
           </w:p>
         </w:tc>
@@ -21924,7 +21946,7 @@
                 <w:sz w:val="18"/>
                 <w:szCs w:val="18"/>
               </w:rPr>
-              <w:t xml:space="preserve">V2 aggiunto — cliente non può essere eliminato con spedizioni</w:t>
+              <w:t xml:space="preserve">V2 aggiunto â€” cliente non puÃ² essere eliminato con spedizioni</w:t>
             </w:r>
           </w:p>
         </w:tc>
@@ -21992,7 +22014,7 @@
                 <w:sz w:val="18"/>
                 <w:szCs w:val="18"/>
               </w:rPr>
-              <w:t xml:space="preserve">→ destinazioni_clienti.id</w:t>
+              <w:t xml:space="preserve">â†’ destinazioni_clienti.id</w:t>
             </w:r>
           </w:p>
         </w:tc>
@@ -22126,7 +22148,7 @@
                 <w:sz w:val="18"/>
                 <w:szCs w:val="18"/>
               </w:rPr>
-              <w:t xml:space="preserve">→ ordini.id</w:t>
+              <w:t xml:space="preserve">â†’ ordini.id</w:t>
             </w:r>
           </w:p>
         </w:tc>
@@ -22260,7 +22282,7 @@
                 <w:sz w:val="18"/>
                 <w:szCs w:val="18"/>
               </w:rPr>
-              <w:t xml:space="preserve">—</w:t>
+              <w:t xml:space="preserve">â€”</w:t>
             </w:r>
           </w:p>
         </w:tc>
@@ -22388,7 +22410,7 @@
           <w:sz w:val="20"/>
           <w:szCs w:val="20"/>
         </w:rPr>
-        <w:t xml:space="preserve">M16 — richiesta_acquisto_state  [NUOVO V2]</w:t>
+        <w:t xml:space="preserve">M16 â€” richiesta_acquisto_state  [NUOVO V2]</w:t>
       </w:r>
     </w:p>
     <w:tbl>
@@ -22577,7 +22599,7 @@
                 <w:sz w:val="18"/>
                 <w:szCs w:val="18"/>
               </w:rPr>
-              <w:t xml:space="preserve">—</w:t>
+              <w:t xml:space="preserve">â€”</w:t>
             </w:r>
           </w:p>
         </w:tc>
@@ -23253,7 +23275,7 @@
           <w:sz w:val="18"/>
           <w:szCs w:val="18"/>
         </w:rPr>
-        <w:t xml:space="preserve">Le state machine M08 (purchase_order_state), M09 (sales_order_state + picking), M10 (shipping_state) sono invariate da V1.3 — documentate nell'Analisi Funzionale V3, sezione 5.</w:t>
+        <w:t xml:space="preserve">Le state machine M08 (purchase_order_state), M09 (sales_order_state + picking), M10 (shipping_state) sono invariate da V1.3 â€” documentate nell'Analisi Funzionale V3, sezione 5.</w:t>
       </w:r>
     </w:p>
     <w:p>
@@ -23312,7 +23334,7 @@
           <w:sz w:val="20"/>
           <w:szCs w:val="20"/>
         </w:rPr>
-        <w:t xml:space="preserve">8.1  fn_set_updated_at — stato post-migration 113</w:t>
+        <w:t xml:space="preserve">8.1  fn_set_updated_at â€” stato post-migration 113</w:t>
       </w:r>
     </w:p>
     <w:p>
@@ -23573,7 +23595,7 @@
                 <w:sz w:val="18"/>
                 <w:szCs w:val="18"/>
               </w:rPr>
-              <w:t xml:space="preserve">FOR EACH ROW ✓</w:t>
+              <w:t xml:space="preserve">FOR EACH ROW âœ“</w:t>
             </w:r>
           </w:p>
         </w:tc>
@@ -23607,7 +23629,7 @@
                 <w:sz w:val="18"/>
                 <w:szCs w:val="18"/>
               </w:rPr>
-              <w:t xml:space="preserve">FOR EACH ROW ✓</w:t>
+              <w:t xml:space="preserve">FOR EACH ROW âœ“</w:t>
             </w:r>
           </w:p>
         </w:tc>
@@ -23640,7 +23662,7 @@
                 <w:sz w:val="18"/>
                 <w:szCs w:val="18"/>
               </w:rPr>
-              <w:t xml:space="preserve">16 tabelle già corrette</w:t>
+              <w:t xml:space="preserve">16 tabelle giÃ  corrette</w:t>
             </w:r>
           </w:p>
         </w:tc>
@@ -23710,7 +23732,7 @@
                 <w:sz w:val="18"/>
                 <w:szCs w:val="18"/>
               </w:rPr>
-              <w:t xml:space="preserve">FOR EACH STATEMENT ❌</w:t>
+              <w:t xml:space="preserve">FOR EACH STATEMENT âŒ</w:t>
             </w:r>
           </w:p>
         </w:tc>
@@ -23744,7 +23766,7 @@
                 <w:sz w:val="18"/>
                 <w:szCs w:val="18"/>
               </w:rPr>
-              <w:t xml:space="preserve">FOR EACH ROW ✓ (migration 113)</w:t>
+              <w:t xml:space="preserve">FOR EACH ROW âœ“ (migration 113)</w:t>
             </w:r>
           </w:p>
         </w:tc>
@@ -23913,7 +23935,7 @@
                 <w:sz w:val="18"/>
                 <w:szCs w:val="18"/>
               </w:rPr>
-              <w:t xml:space="preserve">Append-only per RULES — UPDATE non possibile</w:t>
+              <w:t xml:space="preserve">Append-only per RULES â€” UPDATE non possibile</w:t>
             </w:r>
           </w:p>
         </w:tc>
@@ -24005,7 +24027,7 @@
                 <w:sz w:val="18"/>
                 <w:szCs w:val="18"/>
               </w:rPr>
-              <w:t xml:space="preserve">Proprietà</w:t>
+              <w:t xml:space="preserve">ProprietÃ </w:t>
             </w:r>
           </w:p>
         </w:tc>
@@ -24107,7 +24129,7 @@
                 <w:sz w:val="18"/>
                 <w:szCs w:val="18"/>
               </w:rPr>
-              <w:t xml:space="preserve">fn_set_data_agg_prezzo() — PL/pgSQL</w:t>
+              <w:t xml:space="preserve">fn_set_data_agg_prezzo() â€” PL/pgSQL</w:t>
             </w:r>
           </w:p>
         </w:tc>
@@ -24175,7 +24197,7 @@
                 <w:sz w:val="18"/>
                 <w:szCs w:val="18"/>
               </w:rPr>
-              <w:t xml:space="preserve">trg_data_agg_prezzo su prodotti — BEFORE UPDATE FOR EACH ROW ✓</w:t>
+              <w:t xml:space="preserve">trg_data_agg_prezzo su prodotti â€” BEFORE UPDATE FOR EACH ROW âœ“</w:t>
             </w:r>
           </w:p>
         </w:tc>
@@ -24379,7 +24401,7 @@
                 <w:sz w:val="18"/>
                 <w:szCs w:val="18"/>
               </w:rPr>
-              <w:t xml:space="preserve">UNICA fonte di aggiornamento data_agg_prezzo — il model non include CASE expression ridondanti</w:t>
+              <w:t xml:space="preserve">UNICA fonte di aggiornamento data_agg_prezzo â€” il model non include CASE expression ridondanti</w:t>
             </w:r>
           </w:p>
         </w:tc>
@@ -24471,7 +24493,7 @@
                 <w:sz w:val="18"/>
                 <w:szCs w:val="18"/>
               </w:rPr>
-              <w:t xml:space="preserve">Proprietà</w:t>
+              <w:t xml:space="preserve">ProprietÃ </w:t>
             </w:r>
           </w:p>
         </w:tc>
@@ -24777,7 +24799,7 @@
                 <w:sz w:val="18"/>
                 <w:szCs w:val="18"/>
               </w:rPr>
-              <w:t xml:space="preserve">nextval() è atomico — valori univoci anche con N transazioni concorrenti simultanee</w:t>
+              <w:t xml:space="preserve">nextval() Ã¨ atomico â€” valori univoci anche con N transazioni concorrenti simultanee</w:t>
             </w:r>
           </w:p>
         </w:tc>
@@ -24845,7 +24867,7 @@
                 <w:sz w:val="18"/>
                 <w:szCs w:val="18"/>
               </w:rPr>
-              <w:t xml:space="preserve">ALTER SEQUENCE seq_ddt_numero_progressivo RESTART WITH 1 — migration schedulata per il 1° gennaio. Con numero_ddt TEXT, il reset non è strettamente necessario per l'unicità.</w:t>
+              <w:t xml:space="preserve">ALTER SEQUENCE seq_ddt_numero_progressivo RESTART WITH 1 â€” migration schedulata per il 1Â° gennaio. Con numero_ddt TEXT, il reset non Ã¨ strettamente necessario per l'unicitÃ .</w:t>
             </w:r>
           </w:p>
         </w:tc>
@@ -24906,7 +24928,7 @@
           <w:sz w:val="18"/>
           <w:szCs w:val="18"/>
         </w:rPr>
-        <w:t xml:space="preserve">Conteggio reale dal dump SQL. Esclude gli indici impliciti nei UNIQUE constraint. idx_prodotti_attivo documentato in V1.3 ma ASSENTE dal dump — da aggiungere con migration 114.</w:t>
+        <w:t xml:space="preserve">Conteggio reale dal dump SQL. Esclude gli indici impliciti nei UNIQUE constraint. idx_prodotti_attivo documentato in V1.3 ma ASSENTE dal dump â€” da aggiungere con migration 114.</w:t>
       </w:r>
     </w:p>
     <w:p>
@@ -25552,7 +25574,7 @@
                 <w:sz w:val="18"/>
                 <w:szCs w:val="18"/>
               </w:rPr>
-              <w:t xml:space="preserve">source — V2 NUOVO</w:t>
+              <w:t xml:space="preserve">source â€” V2 NUOVO</w:t>
             </w:r>
           </w:p>
         </w:tc>
@@ -25959,7 +25981,7 @@
                 <w:sz w:val="18"/>
                 <w:szCs w:val="18"/>
               </w:rPr>
-              <w:t xml:space="preserve">source — V2 NUOVO</w:t>
+              <w:t xml:space="preserve">source â€” V2 NUOVO</w:t>
             </w:r>
           </w:p>
         </w:tc>
@@ -27070,7 +27092,7 @@
                 <w:sz w:val="18"/>
                 <w:szCs w:val="18"/>
               </w:rPr>
-              <w:t xml:space="preserve">(prodotto_id, created_at) — composito</w:t>
+              <w:t xml:space="preserve">(prodotto_id, created_at) â€” composito</w:t>
             </w:r>
           </w:p>
         </w:tc>
@@ -28588,7 +28610,7 @@
                 <w:sz w:val="18"/>
                 <w:szCs w:val="18"/>
               </w:rPr>
-              <w:t xml:space="preserve">prezzo — V2 NUOVO</w:t>
+              <w:t xml:space="preserve">prezzo â€” V2 NUOVO</w:t>
             </w:r>
           </w:p>
         </w:tc>
@@ -28692,7 +28714,7 @@
                 <w:sz w:val="18"/>
                 <w:szCs w:val="18"/>
               </w:rPr>
-              <w:t xml:space="preserve">fornitore_id — V2 NUOVO</w:t>
+              <w:t xml:space="preserve">fornitore_id â€” V2 NUOVO</w:t>
             </w:r>
           </w:p>
         </w:tc>
@@ -28796,7 +28818,7 @@
                 <w:sz w:val="18"/>
                 <w:szCs w:val="18"/>
               </w:rPr>
-              <w:t xml:space="preserve">stato — V2 NUOVO</w:t>
+              <w:t xml:space="preserve">stato â€” V2 NUOVO</w:t>
             </w:r>
           </w:p>
         </w:tc>
@@ -28900,7 +28922,7 @@
                 <w:sz w:val="18"/>
                 <w:szCs w:val="18"/>
               </w:rPr>
-              <w:t xml:space="preserve">utente_id — V2 NUOVO</w:t>
+              <w:t xml:space="preserve">utente_id â€” V2 NUOVO</w:t>
             </w:r>
           </w:p>
         </w:tc>
@@ -29004,7 +29026,7 @@
                 <w:sz w:val="18"/>
                 <w:szCs w:val="18"/>
               </w:rPr>
-              <w:t xml:space="preserve">(utente_id, data_richiesta DESC) — composito, V2 NUOVO</w:t>
+              <w:t xml:space="preserve">(utente_id, data_richiesta DESC) â€” composito, V2 NUOVO</w:t>
             </w:r>
           </w:p>
         </w:tc>
@@ -29108,7 +29130,7 @@
                 <w:sz w:val="18"/>
                 <w:szCs w:val="18"/>
               </w:rPr>
-              <w:t xml:space="preserve">richiesta_id — V2 NUOVO</w:t>
+              <w:t xml:space="preserve">richiesta_id â€” V2 NUOVO</w:t>
             </w:r>
           </w:p>
         </w:tc>
@@ -29212,7 +29234,7 @@
                 <w:sz w:val="18"/>
                 <w:szCs w:val="18"/>
               </w:rPr>
-              <w:t xml:space="preserve">prodotto_id — V2 NUOVO</w:t>
+              <w:t xml:space="preserve">prodotto_id â€” V2 NUOVO</w:t>
             </w:r>
           </w:p>
         </w:tc>
@@ -29919,7 +29941,7 @@
                 <w:sz w:val="18"/>
                 <w:szCs w:val="18"/>
               </w:rPr>
-              <w:t xml:space="preserve">(magazzino_id, codice) — composito</w:t>
+              <w:t xml:space="preserve">(magazzino_id, codice) â€” composito</w:t>
             </w:r>
           </w:p>
         </w:tc>
@@ -30124,7 +30146,7 @@
                 <w:sz w:val="18"/>
                 <w:szCs w:val="18"/>
               </w:rPr>
-              <w:t xml:space="preserve">attivo — MANCANTE: documentato in V1.3 ma non creato nel DB. Da aggiungere con migration 114.</w:t>
+              <w:t xml:space="preserve">attivo â€” MANCANTE: documentato in V1.3 ma non creato nel DB. Da aggiungere con migration 114.</w:t>
             </w:r>
           </w:p>
         </w:tc>
@@ -30166,7 +30188,7 @@
           <w:sz w:val="20"/>
           <w:szCs w:val="20"/>
         </w:rPr>
-        <w:t xml:space="preserve">11. Divergenze V1.3 → Implementazione V2 (dal dump SQL)</w:t>
+        <w:t xml:space="preserve">11. Divergenze V1.3 â†’ Implementazione V2 (dal dump SQL)</w:t>
       </w:r>
     </w:p>
     <w:tbl>
@@ -30422,7 +30444,7 @@
                 <w:sz w:val="18"/>
                 <w:szCs w:val="18"/>
               </w:rPr>
-              <w:t xml:space="preserve">ubicazione_id NOT NULL — FK singola</w:t>
+              <w:t xml:space="preserve">ubicazione_id NOT NULL â€” FK singola</w:t>
             </w:r>
           </w:p>
         </w:tc>
@@ -30557,7 +30579,7 @@
                 <w:sz w:val="18"/>
                 <w:szCs w:val="18"/>
               </w:rPr>
-              <w:t xml:space="preserve">riferimento TEXT — campo unificato</w:t>
+              <w:t xml:space="preserve">riferimento TEXT â€” campo unificato</w:t>
             </w:r>
           </w:p>
         </w:tc>
@@ -30725,7 +30747,7 @@
                 <w:sz w:val="18"/>
                 <w:szCs w:val="18"/>
               </w:rPr>
-              <w:t xml:space="preserve">Più forte</w:t>
+              <w:t xml:space="preserve">PiÃ¹ forte</w:t>
             </w:r>
           </w:p>
         </w:tc>
@@ -30760,7 +30782,7 @@
                 <w:sz w:val="18"/>
                 <w:szCs w:val="18"/>
               </w:rPr>
-              <w:t xml:space="preserve">magazzini.attiva → attivo</w:t>
+              <w:t xml:space="preserve">magazzini.attiva â†’ attivo</w:t>
             </w:r>
           </w:p>
         </w:tc>
@@ -31030,7 +31052,7 @@
                 <w:sz w:val="18"/>
                 <w:szCs w:val="18"/>
               </w:rPr>
-              <w:t xml:space="preserve">ubicazioni.attiva → attivo</w:t>
+              <w:t xml:space="preserve">ubicazioni.attiva â†’ attivo</w:t>
             </w:r>
           </w:p>
         </w:tc>
@@ -31165,7 +31187,7 @@
                 <w:sz w:val="18"/>
                 <w:szCs w:val="18"/>
               </w:rPr>
-              <w:t xml:space="preserve">corrieri.email_operativa → email</w:t>
+              <w:t xml:space="preserve">corrieri.email_operativa â†’ email</w:t>
             </w:r>
           </w:p>
         </w:tc>
@@ -31333,7 +31355,7 @@
                 <w:sz w:val="18"/>
                 <w:szCs w:val="18"/>
               </w:rPr>
-              <w:t xml:space="preserve">FK → utenti NULLABLE</w:t>
+              <w:t xml:space="preserve">FK â†’ utenti NULLABLE</w:t>
             </w:r>
           </w:p>
         </w:tc>
@@ -31603,7 +31625,7 @@
                 <w:sz w:val="18"/>
                 <w:szCs w:val="18"/>
               </w:rPr>
-              <w:t xml:space="preserve">→ corrieri NOT NULL</w:t>
+              <w:t xml:space="preserve">â†’ corrieri NOT NULL</w:t>
             </w:r>
           </w:p>
         </w:tc>
@@ -31637,7 +31659,7 @@
                 <w:sz w:val="18"/>
                 <w:szCs w:val="18"/>
               </w:rPr>
-              <w:t xml:space="preserve">→ dipendenti NULLABLE ON DELETE SET NULL</w:t>
+              <w:t xml:space="preserve">â†’ dipendenti NULLABLE ON DELETE SET NULL</w:t>
             </w:r>
           </w:p>
         </w:tc>
@@ -32515,7 +32537,7 @@
                 <w:sz w:val="18"/>
                 <w:szCs w:val="18"/>
               </w:rPr>
-              <w:t xml:space="preserve">Trigger set_updated_at granularità</w:t>
+              <w:t xml:space="preserve">Trigger set_updated_at granularitÃ </w:t>
             </w:r>
           </w:p>
         </w:tc>
@@ -32582,7 +32604,7 @@
                 <w:sz w:val="18"/>
                 <w:szCs w:val="18"/>
               </w:rPr>
-              <w:t xml:space="preserve">FOR EACH ROW su tutte le tabelle — già consolidato in 001–011 (livello ROW definito una sola volta)</w:t>
+              <w:t xml:space="preserve">FOR EACH ROW su tutte le tabelle â€” giÃ  consolidato in 001â€“011 (livello ROW definito una sola volta)</w:t>
             </w:r>
           </w:p>
         </w:tc>
@@ -32675,7 +32697,7 @@
           <w:sz w:val="20"/>
           <w:szCs w:val="20"/>
         </w:rPr>
-        <w:t xml:space="preserve">La V1.3 prevedeva ubicazione_da_id + ubicazione_a_id separati per tracciare l'origine e la destinazione di ogni movimento. L'implementazione usa un'unica ubicazione_id NOT NULL. Impatto su M07: per uno SPOSTAMENTO (es. slot A → slot B) il service deve generare due record movimenti_stock: uno SCARICO su ubicazione A e uno CARICO su ubicazione B. Il campo riferimento TEXT unifica l'identificativo del documento sorgente (es. "ordine_acquisto:42").</w:t>
+        <w:t xml:space="preserve">La V1.3 prevedeva ubicazione_da_id + ubicazione_a_id separati per tracciare l'origine e la destinazione di ogni movimento. L'implementazione usa un'unica ubicazione_id NOT NULL. Impatto su M07: per uno SPOSTAMENTO (es. slot A â†’ slot B) il service deve generare due record movimenti_stock: uno SCARICO su ubicazione A e uno CARICO su ubicazione B. Il campo riferimento TEXT unifica l'identificativo del documento sorgente (es. "ordine_acquisto:42").</w:t>
       </w:r>
     </w:p>
     <w:p>
@@ -33038,7 +33060,7 @@
                 <w:sz w:val="18"/>
                 <w:szCs w:val="18"/>
               </w:rPr>
-              <w:t xml:space="preserve">7 ✓</w:t>
+              <w:t xml:space="preserve">7 âœ“</w:t>
             </w:r>
           </w:p>
         </w:tc>
@@ -33206,7 +33228,7 @@
                 <w:sz w:val="18"/>
                 <w:szCs w:val="18"/>
               </w:rPr>
-              <w:t xml:space="preserve">27 ✓</w:t>
+              <w:t xml:space="preserve">27 âœ“</w:t>
             </w:r>
           </w:p>
         </w:tc>
@@ -33374,7 +33396,7 @@
                 <w:sz w:val="18"/>
                 <w:szCs w:val="18"/>
               </w:rPr>
-              <w:t xml:space="preserve">37 ✓</w:t>
+              <w:t xml:space="preserve">37 âœ“</w:t>
             </w:r>
           </w:p>
         </w:tc>
@@ -33407,7 +33429,7 @@
                 <w:sz w:val="18"/>
                 <w:szCs w:val="18"/>
               </w:rPr>
-              <w:t xml:space="preserve">+2 righe_richiesta→richieste, richieste→utenti</w:t>
+              <w:t xml:space="preserve">+2 righe_richiestaâ†’richieste, richiesteâ†’utenti</w:t>
             </w:r>
           </w:p>
         </w:tc>
@@ -33542,7 +33564,7 @@
                 <w:sz w:val="18"/>
                 <w:szCs w:val="18"/>
               </w:rPr>
-              <w:t xml:space="preserve">13 ✓</w:t>
+              <w:t xml:space="preserve">13 âœ“</w:t>
             </w:r>
           </w:p>
         </w:tc>
@@ -33710,7 +33732,7 @@
                 <w:sz w:val="18"/>
                 <w:szCs w:val="18"/>
               </w:rPr>
-              <w:t xml:space="preserve">4 ✓</w:t>
+              <w:t xml:space="preserve">4 âœ“</w:t>
             </w:r>
           </w:p>
         </w:tc>
@@ -33878,7 +33900,7 @@
                 <w:sz w:val="18"/>
                 <w:szCs w:val="18"/>
               </w:rPr>
-              <w:t xml:space="preserve">1 ✓</w:t>
+              <w:t xml:space="preserve">1 âœ“</w:t>
             </w:r>
           </w:p>
         </w:tc>
@@ -34046,7 +34068,7 @@
                 <w:sz w:val="18"/>
                 <w:szCs w:val="18"/>
               </w:rPr>
-              <w:t xml:space="preserve">49 ✓</w:t>
+              <w:t xml:space="preserve">49 âœ“</w:t>
             </w:r>
           </w:p>
         </w:tc>
@@ -34079,7 +34101,7 @@
                 <w:sz w:val="18"/>
                 <w:szCs w:val="18"/>
               </w:rPr>
-              <w:t xml:space="preserve">Molti più indici di quanti documentati. Aggiornati in sez. 8.</w:t>
+              <w:t xml:space="preserve">Molti piÃ¹ indici di quanti documentati. Aggiornati in sez. 8.</w:t>
             </w:r>
           </w:p>
         </w:tc>
@@ -34214,7 +34236,7 @@
                 <w:sz w:val="18"/>
                 <w:szCs w:val="18"/>
               </w:rPr>
-              <w:t xml:space="preserve">27 (+bug→fix113)</w:t>
+              <w:t xml:space="preserve">27 (+bugâ†’fix113)</w:t>
             </w:r>
           </w:p>
         </w:tc>
@@ -34247,7 +34269,7 @@
                 <w:sz w:val="18"/>
                 <w:szCs w:val="18"/>
               </w:rPr>
-              <w:t xml:space="preserve">Tutti FOR EACH ROW nella baseline consolidata 001–011 (nessun trigger a livello STATEMENT).</w:t>
+              <w:t xml:space="preserve">Tutti FOR EACH ROW nella baseline consolidata 001â€“011 (nessun trigger a livello STATEMENT).</w:t>
             </w:r>
           </w:p>
         </w:tc>
@@ -34385,7 +34407,7 @@
                 <w:sz w:val="18"/>
                 <w:szCs w:val="18"/>
               </w:rPr>
-              <w:t xml:space="preserve">1 ✓</w:t>
+              <w:t xml:space="preserve">1 âœ“</w:t>
             </w:r>
           </w:p>
         </w:tc>
@@ -34419,7 +34441,7 @@
                 <w:sz w:val="18"/>
                 <w:szCs w:val="18"/>
               </w:rPr>
-              <w:t xml:space="preserve">trg_data_agg_prezzo FOR EACH ROW ✓</w:t>
+              <w:t xml:space="preserve">trg_data_agg_prezzo FOR EACH ROW âœ“</w:t>
             </w:r>
           </w:p>
         </w:tc>
@@ -34557,7 +34579,7 @@
                 <w:sz w:val="18"/>
                 <w:szCs w:val="18"/>
               </w:rPr>
-              <w:t xml:space="preserve">2 ✓</w:t>
+              <w:t xml:space="preserve">2 âœ“</w:t>
             </w:r>
           </w:p>
         </w:tc>
@@ -34659,7 +34681,7 @@
                 <w:sz w:val="18"/>
                 <w:szCs w:val="18"/>
               </w:rPr>
-              <w:t xml:space="preserve">—</w:t>
+              <w:t xml:space="preserve">â€”</w:t>
             </w:r>
           </w:p>
         </w:tc>
@@ -34759,7 +34781,7 @@
                 <w:sz w:val="18"/>
                 <w:szCs w:val="18"/>
               </w:rPr>
-              <w:t xml:space="preserve">Baseline consolidata 001–011; pgmigrations conferma esecuzione completa</w:t>
+              <w:t xml:space="preserve">Baseline consolidata 001â€“011; pgmigrations conferma esecuzione completa</w:t>
             </w:r>
           </w:p>
         </w:tc>
@@ -34800,7 +34822,122 @@
           <w:sz w:val="18"/>
           <w:szCs w:val="18"/>
         </w:rPr>
-        <w:t xml:space="preserve">Giugno 2026 — LogiChain ERP — Analisi Database V3.0 (verificata da SQL dump e codebase) — CONFIDENZIALE</w:t>
+        <w:t xml:space="preserve">Giugno 2026 â€” LogiChain ERP â€” Analisi Database V3.0 (verificata da SQL dump e codebase) â€” CONFIDENZIALE</w:t>
+      </w:r>
+    </w:p>
+    <w:p>
+      <w:r>
+        <w:t xml:space="preserve"> </w:t>
+      </w:r>
+    </w:p>
+    <w:p>
+      <w:r>
+        <w:rPr>
+          <w:b/>
+        </w:rPr>
+        <w:t>13. Addendum Verifica Repo Attuale</w:t>
+      </w:r>
+    </w:p>
+    <w:p>
+      <w:r>
+        <w:t>Aggiornato al 12 Giugno 2026. Questo addendum integra e, in caso di conflitto, sostituisce i riferimenti legacy presenti nelle sezioni 1, 2, 8, 10 e 12.</w:t>
+      </w:r>
+    </w:p>
+    <w:p>
+      <w:r>
+        <w:rPr>
+          <w:b/>
+        </w:rPr>
+        <w:t>13.1 Fonte Autoritativa Corrente</w:t>
+      </w:r>
+    </w:p>
+    <w:p>
+      <w:r>
+        <w:t>La fonte autoritativa verificabile nel repository corrente e costituita dalle migration backend 001–011 presenti in codice/backend/migrations. I riferimenti a dump SQL esterni e alla numerazione legacy 001–113 non rappresentano piu la baseline operativa del repo attuale.</w:t>
+      </w:r>
+    </w:p>
+    <w:p>
+      <w:r>
+        <w:rPr>
+          <w:b/>
+        </w:rPr>
+        <w:t>13.2 Correzioni Verificate</w:t>
+      </w:r>
+    </w:p>
+    <w:p>
+      <w:r>
+        <w:t>Le 7 enum correnti sono create direttamente in 001_enums_and_functions.js. I riferimenti del documento a migration 103 e 104 sono quindi da considerare storici e superati nel repo attuale.</w:t>
+      </w:r>
+    </w:p>
+    <w:p>
+      <w:r>
+        <w:t>La funzione fn_set_data_agg_prezzo e creata in 001_enums_and_functions.js e il trigger trg_data_agg_prezzo e definito in 003_prodotti_categorie.js. I riferimenti a migration 111 e 113 sono storici e non applicabili alla baseline consolidata 001–011.</w:t>
+      </w:r>
+    </w:p>
+    <w:p>
+      <w:r>
+        <w:t>L'indice idx_prodotti_attivo ESISTE gia nel repository corrente ed e creato in 003_prodotti_categorie.js. La nota che lo descrive come assente e da aggiungere con migration 114 non e piu corretta.</w:t>
+      </w:r>
+    </w:p>
+    <w:p>
+      <w:r>
+        <w:t>Le RULES append-only di movimenti_stock sono gia presenti in 007_inventario.js: movimenti_stock_no_update_rule e movimenti_stock_no_delete_rule.</w:t>
+      </w:r>
+    </w:p>
+    <w:p>
+      <w:r>
+        <w:rPr>
+          <w:b/>
+        </w:rPr>
+        <w:t>13.3 Conteggi Verificati su Migration Correnti</w:t>
+      </w:r>
+    </w:p>
+    <w:p>
+      <w:r>
+        <w:t>Migration presenti nel repository: 11 file (001–011).</w:t>
+      </w:r>
+    </w:p>
+    <w:p>
+      <w:r>
+        <w:t>Tabelle applicative create dalle migration: 27.</w:t>
+      </w:r>
+    </w:p>
+    <w:p>
+      <w:r>
+        <w:t>Enum create dalle migration: 7.</w:t>
+      </w:r>
+    </w:p>
+    <w:p>
+      <w:r>
+        <w:t>CreateIndex espliciti rilevati nelle migration: 47.</w:t>
+      </w:r>
+    </w:p>
+    <w:p>
+      <w:r>
+        <w:t>CreateTrigger espliciti rilevati nelle migration: 27.</w:t>
+      </w:r>
+    </w:p>
+    <w:p>
+      <w:r>
+        <w:t>Sequence esplicite: 1 (seq_ddt_numero_progressivo).</w:t>
+      </w:r>
+    </w:p>
+    <w:p>
+      <w:r>
+        <w:t>RULES append-only esplicite: 2 su movimenti_stock.</w:t>
+      </w:r>
+    </w:p>
+    <w:p>
+      <w:r>
+        <w:rPr>
+          <w:b/>
+        </w:rPr>
+        <w:t>13.4 Impatto sul Documento</w:t>
+      </w:r>
+    </w:p>
+    <w:p>
+      <w:r>
+        <w:t>Le sezioni che citano 49 indici, 113 migration, migration 103/104/111/113 oppure l'assenza di idx_prodotti_attivo devono essere lette alla luce di questo addendum. Lo schema funzionale descritto resta coerente, ma quei riferimenti numerici e di numerazione migration non sono piu aggiornati rispetto al repository corrente.</w:t>
       </w:r>
     </w:p>
     <w:sectPr>
@@ -34813,11 +34950,7 @@
 </w:document>
 </file>
 
-<file path=word/comments.xml><?xml version="1.0" encoding="utf-8"?>
-<w:comments xmlns:cx="http://schemas.microsoft.com/office/drawing/2014/chartex" xmlns:cx1="http://schemas.microsoft.com/office/drawing/2015/9/8/chartex" xmlns:cx2="http://schemas.microsoft.com/office/drawing/2015/10/21/chartex" xmlns:cx3="http://schemas.microsoft.com/office/drawing/2016/5/9/chartex" xmlns:cx4="http://schemas.microsoft.com/office/drawing/2016/5/10/chartex" xmlns:cx5="http://schemas.microsoft.com/office/drawing/2016/5/11/chartex" xmlns:cx6="http://schemas.microsoft.com/office/drawing/2016/5/12/chartex" xmlns:cx7="http://schemas.microsoft.com/office/drawing/2016/5/13/chartex" xmlns:cx8="http://schemas.microsoft.com/office/drawing/2016/5/14/chartex" xmlns:mc="http://schemas.openxmlformats.org/markup-compatibility/2006" xmlns:aink="http://schemas.microsoft.com/office/drawing/2016/ink" xmlns:am3d="http://schemas.microsoft.com/office/drawing/2017/model3d" xmlns:o="urn:schemas-microsoft-com:office:office" xmlns:r="http://schemas.openxmlformats.org/officeDocument/2006/relationships" xmlns:m="http://schemas.openxmlformats.org/officeDocument/2006/math" xmlns:v="urn:schemas-microsoft-com:vml" xmlns:wp14="http://schemas.microsoft.com/office/word/2010/wordprocessingDrawing" xmlns:wp="http://schemas.openxmlformats.org/drawingml/2006/wordprocessingDrawing" xmlns:w10="urn:schemas-microsoft-com:office:word" xmlns:w="http://schemas.openxmlformats.org/wordprocessingml/2006/main" xmlns:w14="http://schemas.microsoft.com/office/word/2010/wordml" xmlns:w15="http://schemas.microsoft.com/office/word/2012/wordml" xmlns:w16cex="http://schemas.microsoft.com/office/word/2018/wordml/cex" xmlns:w16cid="http://schemas.microsoft.com/office/word/2016/wordml/cid" xmlns:w16="http://schemas.microsoft.com/office/word/2018/wordml" xmlns:w16sdtdh="http://schemas.microsoft.com/office/word/2020/wordml/sdtdatahash" xmlns:w16se="http://schemas.microsoft.com/office/word/2015/wordml/symex" xmlns:wpg="http://schemas.microsoft.com/office/word/2010/wordprocessingGroup" xmlns:wpi="http://schemas.microsoft.com/office/word/2010/wordprocessingInk" xmlns:wne="http://schemas.microsoft.com/office/word/2006/wordml" xmlns:wps="http://schemas.microsoft.com/office/word/2010/wordprocessingShape"/>
-</file>
-
-<file path=word/endnotes.xml><?xml version="1.0" encoding="utf-8"?>
+<file path=word\endnotes.xml><?xml version="1.0" encoding="utf-8"?>
 <w:endnotes xmlns:wpc="http://schemas.microsoft.com/office/word/2010/wordprocessingCanvas" xmlns:mc="http://schemas.openxmlformats.org/markup-compatibility/2006" xmlns:o="urn:schemas-microsoft-com:office:office" xmlns:r="http://schemas.openxmlformats.org/officeDocument/2006/relationships" xmlns:m="http://schemas.openxmlformats.org/officeDocument/2006/math" xmlns:v="urn:schemas-microsoft-com:vml" xmlns:wp14="http://schemas.microsoft.com/office/word/2010/wordprocessingDrawing" xmlns:wp="http://schemas.openxmlformats.org/drawingml/2006/wordprocessingDrawing" xmlns:w10="urn:schemas-microsoft-com:office:word" xmlns:w="http://schemas.openxmlformats.org/wordprocessingml/2006/main" xmlns:w14="http://schemas.microsoft.com/office/word/2010/wordml" xmlns:w15="http://schemas.microsoft.com/office/word/2012/wordml" xmlns:wpg="http://schemas.microsoft.com/office/word/2010/wordprocessingGroup" xmlns:wpi="http://schemas.microsoft.com/office/word/2010/wordprocessingInk" xmlns:wne="http://schemas.microsoft.com/office/word/2006/wordml" xmlns:wps="http://schemas.microsoft.com/office/word/2010/wordprocessingShape" mc:Ignorable="w14 w15 wp14">
   <w:endnote w:type="separator" w:id="-1">
     <w:p>
@@ -34854,7 +34987,11 @@
 </w:endnotes>
 </file>
 
-<file path=word/footnotes.xml><?xml version="1.0" encoding="utf-8"?>
+<file path=word\fontTable.xml><?xml version="1.0" encoding="utf-8"?>
+<w:fonts xmlns:mc="http://schemas.openxmlformats.org/markup-compatibility/2006" xmlns:r="http://schemas.openxmlformats.org/officeDocument/2006/relationships" xmlns:w="http://schemas.openxmlformats.org/wordprocessingml/2006/main" xmlns:w14="http://schemas.microsoft.com/office/word/2010/wordml" xmlns:w15="http://schemas.microsoft.com/office/word/2012/wordml" xmlns:w16cex="http://schemas.microsoft.com/office/word/2018/wordml/cex" xmlns:w16cid="http://schemas.microsoft.com/office/word/2016/wordml/cid" xmlns:w16="http://schemas.microsoft.com/office/word/2018/wordml" xmlns:w16sdtdh="http://schemas.microsoft.com/office/word/2020/wordml/sdtdatahash" xmlns:w16se="http://schemas.microsoft.com/office/word/2015/wordml/symex" mc:Ignorable="w14 w15 w16se w16cid w16 w16cex w16sdtdh"/>
+</file>
+
+<file path=word\footnotes.xml><?xml version="1.0" encoding="utf-8"?>
 <w:footnotes xmlns:wpc="http://schemas.microsoft.com/office/word/2010/wordprocessingCanvas" xmlns:mc="http://schemas.openxmlformats.org/markup-compatibility/2006" xmlns:o="urn:schemas-microsoft-com:office:office" xmlns:r="http://schemas.openxmlformats.org/officeDocument/2006/relationships" xmlns:m="http://schemas.openxmlformats.org/officeDocument/2006/math" xmlns:v="urn:schemas-microsoft-com:vml" xmlns:wp14="http://schemas.microsoft.com/office/word/2010/wordprocessingDrawing" xmlns:wp="http://schemas.openxmlformats.org/drawingml/2006/wordprocessingDrawing" xmlns:w10="urn:schemas-microsoft-com:office:word" xmlns:w="http://schemas.openxmlformats.org/wordprocessingml/2006/main" xmlns:w14="http://schemas.microsoft.com/office/word/2010/wordml" xmlns:w15="http://schemas.microsoft.com/office/word/2012/wordml" xmlns:wpg="http://schemas.microsoft.com/office/word/2010/wordprocessingGroup" xmlns:wpi="http://schemas.microsoft.com/office/word/2010/wordprocessingInk" xmlns:wne="http://schemas.microsoft.com/office/word/2006/wordml" xmlns:wps="http://schemas.microsoft.com/office/word/2010/wordprocessingShape" mc:Ignorable="w14 w15 wp14">
   <w:footnote w:type="separator" w:id="-1">
     <w:p>
@@ -34891,7 +35028,7 @@
 </w:footnotes>
 </file>
 
-<file path=word/numbering.xml><?xml version="1.0" encoding="utf-8"?>
+<file path=word\numbering.xml><?xml version="1.0" encoding="utf-8"?>
 <w:numbering xmlns:wpc="http://schemas.microsoft.com/office/word/2010/wordprocessingCanvas" xmlns:mc="http://schemas.openxmlformats.org/markup-compatibility/2006" xmlns:o="urn:schemas-microsoft-com:office:office" xmlns:r="http://schemas.openxmlformats.org/officeDocument/2006/relationships" xmlns:m="http://schemas.openxmlformats.org/officeDocument/2006/math" xmlns:v="urn:schemas-microsoft-com:vml" xmlns:wp14="http://schemas.microsoft.com/office/word/2010/wordprocessingDrawing" xmlns:wp="http://schemas.openxmlformats.org/drawingml/2006/wordprocessingDrawing" xmlns:w10="urn:schemas-microsoft-com:office:word" xmlns:w="http://schemas.openxmlformats.org/wordprocessingml/2006/main" xmlns:w14="http://schemas.microsoft.com/office/word/2010/wordml" xmlns:w15="http://schemas.microsoft.com/office/word/2012/wordml" xmlns:wpg="http://schemas.microsoft.com/office/word/2010/wordprocessingGroup" xmlns:wpi="http://schemas.microsoft.com/office/word/2010/wordprocessingInk" xmlns:wne="http://schemas.microsoft.com/office/word/2006/wordml" xmlns:wps="http://schemas.microsoft.com/office/word/2010/wordprocessingShape" mc:Ignorable="w14 w15 wp14">
   <w:abstractNum w:abstractNumId="1" w15:restartNumberingAfterBreak="0">
     <w:multiLevelType w:val="hybridMultilevel"/>
@@ -35005,7 +35142,17 @@
 </w:numbering>
 </file>
 
-<file path=word/styles.xml><?xml version="1.0" encoding="utf-8"?>
+<file path=word\settings.xml><?xml version="1.0" encoding="utf-8"?>
+<w:settings xmlns:wpc="http://schemas.microsoft.com/office/word/2010/wordprocessingCanvas" xmlns:mc="http://schemas.openxmlformats.org/markup-compatibility/2006" xmlns:o="urn:schemas-microsoft-com:office:office" xmlns:r="http://schemas.openxmlformats.org/officeDocument/2006/relationships" xmlns:m="http://schemas.openxmlformats.org/officeDocument/2006/math" xmlns:v="urn:schemas-microsoft-com:vml" xmlns:wp14="http://schemas.microsoft.com/office/word/2010/wordprocessingDrawing" xmlns:wp="http://schemas.openxmlformats.org/drawingml/2006/wordprocessingDrawing" xmlns:w10="urn:schemas-microsoft-com:office:word" xmlns:w="http://schemas.openxmlformats.org/wordprocessingml/2006/main" xmlns:w14="http://schemas.microsoft.com/office/word/2010/wordml" xmlns:w15="http://schemas.microsoft.com/office/word/2012/wordml" xmlns:wpg="http://schemas.microsoft.com/office/word/2010/wordprocessingGroup" xmlns:wpi="http://schemas.microsoft.com/office/word/2010/wordprocessingInk" xmlns:wne="http://schemas.microsoft.com/office/word/2006/wordml" xmlns:wps="http://schemas.microsoft.com/office/word/2010/wordprocessingShape" mc:Ignorable="w14 w15 wp14">
+  <w:displayBackgroundShape/>
+  <w:evenAndOddHeaders w:val="false"/>
+  <w:compat>
+    <w:compatSetting w:val="15" w:name="compatibilityMode" w:uri="http://schemas.microsoft.com/office/word"/>
+  </w:compat>
+</w:settings>
+</file>
+
+<file path=word\styles.xml><?xml version="1.0" encoding="utf-8"?>
 <w:styles xmlns:mc="http://schemas.openxmlformats.org/markup-compatibility/2006" xmlns:r="http://schemas.openxmlformats.org/officeDocument/2006/relationships" xmlns:w="http://schemas.openxmlformats.org/wordprocessingml/2006/main" xmlns:w14="http://schemas.microsoft.com/office/word/2010/wordml" xmlns:w15="http://schemas.microsoft.com/office/word/2012/wordml" mc:Ignorable="w14 w15">
   <w:docDefaults>
     <w:rPrDefault>

</xml_diff>